<commit_message>
Ensure all tables and figures cited at least twice in text
- Table 2 now referenced in Section 3.3 (Operational Excellence)
- Table 3 now referenced in Section 4.2 (Building Future-Ready Organizations)
- All 4 figures and 4 tables confirmed cited 2+ times each
</commit_message>
<xml_diff>
--- a/Chapter_Technology_Competitive_Advantage.docx
+++ b/Chapter_Technology_Competitive_Advantage.docx
@@ -1806,7 +1806,7 @@
         <w:spacing w:after="120" w:line="360" w:lineRule="auto"/>
       </w:pPr>
       <w:r>
-        <w:t xml:space="preserve">Intelligent supply chains leverage IoT, AI, and blockchain technologies to create end-to-end visibility, predictive capabilities, and automated decision-making across complex global supply networks. Technology-enabled resource optimization extends beyond manufacturing to encompass energy management, workforce planning, financial resource allocation, and environmental impact minimization. Organizations that achieve operational excellence through technology integration typically realize 20 to 40 percent improvements in efficiency metrics while simultaneously enhancing quality, flexibility, and sustainability performance. Supply chain digital twins enable scenario planning and risk assessment that significantly improve organizational resilience, allowing firms to simulate disruptions and develop contingency plans before events occur. The integration of demand sensing algorithms with supply planning systems enables organizations to respond to market changes in near real-time, reducing inventory costs while improving service levels. Autonomous logistics systems incorporating self-driving vehicles, drone delivery, and robotic warehousing are poised to transform the economics and speed of physical distribution, creating new competitive advantages for organizations that successfully deploy these technologies at scale.</w:t>
+        <w:t xml:space="preserve">Intelligent supply chains leverage IoT, AI, and blockchain technologies to create end-to-end visibility, predictive capabilities, and automated decision-making across complex global supply networks. Technology-enabled resource optimization extends beyond manufacturing to encompass energy management, workforce planning, financial resource allocation, and environmental impact minimization. As outlined in Table 2, the convergence of IoT sensors, cloud platforms, and big data analytics provides the technological foundation for these intelligent supply chain capabilities. Organizations that achieve operational excellence through technology integration typically realize 20 to 40 percent improvements in efficiency metrics while simultaneously enhancing quality, flexibility, and sustainability performance. Supply chain digital twins enable scenario planning and risk assessment that significantly improve organizational resilience, allowing firms to simulate disruptions and develop contingency plans before events occur. The integration of demand sensing algorithms with supply planning systems enables organizations to respond to market changes in near real-time, reducing inventory costs while improving service levels. Autonomous logistics systems incorporating self-driving vehicles, drone delivery, and robotic warehousing are poised to transform the economics and speed of physical distribution, creating new competitive advantages for organizations that successfully deploy these technologies at scale.</w:t>
       </w:r>
     </w:p>
     <w:p>
@@ -1889,7 +1889,7 @@
         <w:spacing w:after="120" w:line="360" w:lineRule="auto"/>
       </w:pPr>
       <w:r>
-        <w:t xml:space="preserve">Agile leadership and innovation-oriented organizational culture are foundational elements of future-ready organizations. Leaders must cultivate environments that embrace experimentation, tolerate productive failure, and empower distributed decision-making while maintaining strategic coherence and operational discipline. The balance between exploration of new opportunities and exploitation of existing capabilities is particularly challenging in rapidly changing technological environments, requiring ambidextrous organizational designs that simultaneously pursue incremental improvement and breakthrough innovation. Organizational structures are evolving from traditional hierarchies toward network-based, team-centric designs that enable faster decision-making, cross-functional collaboration, and adaptive resource allocation. The role of middle management is being transformed from supervisory and coordinative functions toward coaching, facilitation, and innovation sponsorship as organizations flatten hierarchies and distribute authority closer to the point of value creation and customer interaction. Psychological safety, where team members feel comfortable taking interpersonal risks without fear of punishment or humiliation, has been identified as a critical enabler of innovation and learning in technology-driven organizations, as it encourages the experimentation and knowledge sharing that drive continuous improvement and breakthrough discoveries.</w:t>
+        <w:t xml:space="preserve">Agile leadership and innovation-oriented organizational culture are foundational elements of future-ready organizations. Leaders must cultivate environments that embrace experimentation, tolerate productive failure, and empower distributed decision-making while maintaining strategic coherence and operational discipline. The balance between exploration of new opportunities and exploitation of existing capabilities is particularly challenging in rapidly changing technological environments, requiring ambidextrous organizational designs that simultaneously pursue incremental improvement and breakthrough innovation. Organizational structures are evolving from traditional hierarchies toward network-based, team-centric designs that enable faster decision-making, cross-functional collaboration, and adaptive resource allocation. As demonstrated in Table 3, customer-centric digital strategies require organizations to develop capabilities spanning hyper-personalization, omnichannel integration, and conversational AI, all of which demand agile leadership approaches that can coordinate cross-functional technology deployment at pace. The role of middle management is being transformed from supervisory and coordinative functions toward coaching, facilitation, and innovation sponsorship as organizations flatten hierarchies and distribute authority closer to the point of value creation and customer interaction. Psychological safety, where team members feel comfortable taking interpersonal risks without fear of punishment or humiliation, has been identified as a critical enabler of innovation and learning in technology-driven organizations, as it encourages the experimentation and knowledge sharing that drive continuous improvement and breakthrough discoveries.</w:t>
       </w:r>
     </w:p>
     <w:p>

</xml_diff>